<commit_message>
pre-cleanup snapshot before deleting archive runs
</commit_message>
<xml_diff>
--- a/manuscript/decisions_log_5.docx
+++ b/manuscript/decisions_log_5.docx
@@ -13543,7 +13543,7 @@
                 <w:color w:val="2C2C2C"/>
                 <w:sz w:val="20"/>
               </w:rPr>
-              <w:t>oracle_full sigma_only'yi geçememiştir (p=0.301). Bu bulgu &gt;=90% hedefini aşan, daha güçlü bir testtir — mükemmel rejim bilgisi bile katkı sağlamamaktadır.</w:t>
+              <w:t>oracle_full sigma_only'yi geçememiştir (p=0.115). Bu bulgu &gt;=90% hedefini aşan, daha güçlü bir testtir — mükemmel rejim bilgisi bile katkı sağlamamaktadır.</w:t>
             </w:r>
           </w:p>
         </w:tc>
@@ -13604,6 +13604,1119 @@
                 <w:sz w:val="20"/>
               </w:rPr>
               <w:t>Dedektör kalitesi argümanı kapatılmıştır. Oracle deneyi, herhangi bir dedektör doğruluğunun yeterli olacağını kanıtlamıştır.</w:t>
+            </w:r>
+          </w:p>
+        </w:tc>
+      </w:tr>
+    </w:tbl>
+    <w:p/>
+    <w:tbl>
+      <w:tblPr>
+        <w:tblW w:type="auto" w:w="0"/>
+        <w:tblLook w:firstColumn="1" w:firstRow="1" w:lastColumn="0" w:lastRow="0" w:noHBand="0" w:noVBand="1" w:val="04A0"/>
+      </w:tblPr>
+      <w:tblGrid>
+        <w:gridCol w:w="4873"/>
+        <w:gridCol w:w="4873"/>
+      </w:tblGrid>
+      <w:tr>
+        <w:tc>
+          <w:tcPr>
+            <w:tcW w:w="1400" w:type="dxa"/>
+            <w:tcBorders>
+              <w:top w:val="single" w:color="BBCFE0" w:sz="1"/>
+              <w:left w:val="single" w:color="BBCFE0" w:sz="1"/>
+              <w:bottom w:val="single" w:color="BBCFE0" w:sz="1"/>
+              <w:right w:val="single" w:color="BBCFE0" w:sz="1"/>
+            </w:tcBorders>
+            <w:shd w:fill="1F4E79" w:val="clear"/>
+            <w:tcMar>
+              <w:top w:type="dxa" w:w="80"/>
+              <w:left w:type="dxa" w:w="160"/>
+              <w:bottom w:type="dxa" w:w="80"/>
+              <w:right w:type="dxa" w:w="160"/>
+            </w:tcMar>
+          </w:tcPr>
+          <w:p>
+            <w:r>
+              <w:rPr>
+                <w:rFonts w:ascii="Arial" w:hAnsi="Arial"/>
+                <w:b/>
+                <w:color w:val="FFFFFF"/>
+                <w:sz w:val="20"/>
+              </w:rPr>
+              <w:t>WP5</w:t>
+            </w:r>
+          </w:p>
+        </w:tc>
+        <w:tc>
+          <w:tcPr>
+            <w:tcW w:w="6960" w:type="dxa"/>
+            <w:tcBorders>
+              <w:top w:val="single" w:color="BBCFE0" w:sz="1"/>
+              <w:left w:val="single" w:color="BBCFE0" w:sz="1"/>
+              <w:bottom w:val="single" w:color="BBCFE0" w:sz="1"/>
+              <w:right w:val="single" w:color="BBCFE0" w:sz="1"/>
+            </w:tcBorders>
+            <w:shd w:fill="1F4E79" w:val="clear"/>
+            <w:tcMar>
+              <w:top w:type="dxa" w:w="80"/>
+              <w:left w:type="dxa" w:w="160"/>
+              <w:bottom w:type="dxa" w:w="80"/>
+              <w:right w:type="dxa" w:w="160"/>
+            </w:tcMar>
+          </w:tcPr>
+          <w:p>
+            <w:r>
+              <w:rPr>
+                <w:rFonts w:ascii="Arial" w:hAnsi="Arial"/>
+                <w:b/>
+                <w:color w:val="FFFFFF"/>
+                <w:sz w:val="22"/>
+              </w:rPr>
+              <w:t>#36  thesis_19 — Birim Hatası ve p-Değeri Düzeltmesi</w:t>
+            </w:r>
+          </w:p>
+        </w:tc>
+      </w:tr>
+      <w:tr>
+        <w:tc>
+          <w:tcPr>
+            <w:tcW w:w="1400" w:type="dxa"/>
+            <w:tcBorders>
+              <w:top w:val="single" w:color="BBCFE0" w:sz="1"/>
+              <w:left w:val="single" w:color="BBCFE0" w:sz="1"/>
+              <w:bottom w:val="single" w:color="BBCFE0" w:sz="1"/>
+              <w:right w:val="single" w:color="BBCFE0" w:sz="1"/>
+            </w:tcBorders>
+            <w:shd w:fill="E8F4FD" w:val="clear"/>
+            <w:tcMar>
+              <w:top w:type="dxa" w:w="80"/>
+              <w:left w:type="dxa" w:w="160"/>
+              <w:bottom w:type="dxa" w:w="80"/>
+              <w:right w:type="dxa" w:w="160"/>
+            </w:tcMar>
+          </w:tcPr>
+          <w:p>
+            <w:r>
+              <w:rPr>
+                <w:rFonts w:ascii="Arial" w:hAnsi="Arial"/>
+                <w:b/>
+                <w:color w:val="1F4E79"/>
+                <w:sz w:val="20"/>
+              </w:rPr>
+              <w:t>İkilem</w:t>
+            </w:r>
+          </w:p>
+        </w:tc>
+        <w:tc>
+          <w:tcPr>
+            <w:tcW w:w="6960" w:type="dxa"/>
+            <w:tcBorders>
+              <w:top w:val="single" w:color="BBCFE0" w:sz="1"/>
+              <w:left w:val="single" w:color="BBCFE0" w:sz="1"/>
+              <w:bottom w:val="single" w:color="BBCFE0" w:sz="1"/>
+              <w:right w:val="single" w:color="BBCFE0" w:sz="1"/>
+            </w:tcBorders>
+            <w:shd w:fill="FFFFFF" w:val="clear"/>
+            <w:tcMar>
+              <w:top w:type="dxa" w:w="80"/>
+              <w:left w:type="dxa" w:w="160"/>
+              <w:bottom w:type="dxa" w:w="80"/>
+              <w:right w:type="dxa" w:w="160"/>
+            </w:tcMar>
+          </w:tcPr>
+          <w:p>
+            <w:r>
+              <w:rPr>
+                <w:rFonts w:ascii="Arial" w:hAnsi="Arial"/>
+                <w:b w:val="0"/>
+                <w:color w:val="2C2C2C"/>
+                <w:sz w:val="20"/>
+              </w:rPr>
+              <w:t>thesis_18'de iki faktüel hata tespit edildi: inv_p99 birimi 'tick' olarak yazılmış (doğrusu 'lot'), oracle paradox p-değeri sigma_only vs oracle_full için 0.301 olarak etiketlenmiş (doğrusu 0.115; 0.301 oracle_full vs combined'a aittir).</w:t>
+            </w:r>
+          </w:p>
+        </w:tc>
+      </w:tr>
+      <w:tr>
+        <w:tc>
+          <w:tcPr>
+            <w:tcW w:w="1400" w:type="dxa"/>
+            <w:tcBorders>
+              <w:top w:val="single" w:color="BBCFE0" w:sz="1"/>
+              <w:left w:val="single" w:color="BBCFE0" w:sz="1"/>
+              <w:bottom w:val="single" w:color="BBCFE0" w:sz="1"/>
+              <w:right w:val="single" w:color="BBCFE0" w:sz="1"/>
+            </w:tcBorders>
+            <w:shd w:fill="E8F4FD" w:val="clear"/>
+            <w:tcMar>
+              <w:top w:type="dxa" w:w="80"/>
+              <w:left w:type="dxa" w:w="160"/>
+              <w:bottom w:type="dxa" w:w="80"/>
+              <w:right w:type="dxa" w:w="160"/>
+            </w:tcMar>
+          </w:tcPr>
+          <w:p>
+            <w:r>
+              <w:rPr>
+                <w:rFonts w:ascii="Arial" w:hAnsi="Arial"/>
+                <w:b/>
+                <w:color w:val="1F4E79"/>
+                <w:sz w:val="20"/>
+              </w:rPr>
+              <w:t>Seçenekler</w:t>
+            </w:r>
+          </w:p>
+        </w:tc>
+        <w:tc>
+          <w:tcPr>
+            <w:tcW w:w="6960" w:type="dxa"/>
+            <w:tcBorders>
+              <w:top w:val="single" w:color="BBCFE0" w:sz="1"/>
+              <w:left w:val="single" w:color="BBCFE0" w:sz="1"/>
+              <w:bottom w:val="single" w:color="BBCFE0" w:sz="1"/>
+              <w:right w:val="single" w:color="BBCFE0" w:sz="1"/>
+            </w:tcBorders>
+            <w:shd w:fill="FFFFFF" w:val="clear"/>
+            <w:tcMar>
+              <w:top w:type="dxa" w:w="80"/>
+              <w:left w:type="dxa" w:w="160"/>
+              <w:bottom w:type="dxa" w:w="80"/>
+              <w:right w:type="dxa" w:w="160"/>
+            </w:tcMar>
+          </w:tcPr>
+          <w:p>
+            <w:r>
+              <w:rPr>
+                <w:rFonts w:ascii="Arial" w:hAnsi="Arial"/>
+                <w:b w:val="0"/>
+                <w:color w:val="2C2C2C"/>
+                <w:sz w:val="20"/>
+              </w:rPr>
+              <w:t>A) Errata notu ekle  |  B) Yeni sürüm (thesis_19) oluştur</w:t>
+            </w:r>
+          </w:p>
+        </w:tc>
+      </w:tr>
+      <w:tr>
+        <w:tc>
+          <w:tcPr>
+            <w:tcW w:w="1400" w:type="dxa"/>
+            <w:tcBorders>
+              <w:top w:val="single" w:color="BBCFE0" w:sz="1"/>
+              <w:left w:val="single" w:color="BBCFE0" w:sz="1"/>
+              <w:bottom w:val="single" w:color="BBCFE0" w:sz="1"/>
+              <w:right w:val="single" w:color="BBCFE0" w:sz="1"/>
+            </w:tcBorders>
+            <w:shd w:fill="E8F4FD" w:val="clear"/>
+            <w:tcMar>
+              <w:top w:type="dxa" w:w="80"/>
+              <w:left w:type="dxa" w:w="160"/>
+              <w:bottom w:type="dxa" w:w="80"/>
+              <w:right w:type="dxa" w:w="160"/>
+            </w:tcMar>
+          </w:tcPr>
+          <w:p>
+            <w:r>
+              <w:rPr>
+                <w:rFonts w:ascii="Arial" w:hAnsi="Arial"/>
+                <w:b/>
+                <w:color w:val="1F4E79"/>
+                <w:sz w:val="20"/>
+              </w:rPr>
+              <w:t>Karar</w:t>
+            </w:r>
+          </w:p>
+        </w:tc>
+        <w:tc>
+          <w:tcPr>
+            <w:tcW w:w="6960" w:type="dxa"/>
+            <w:tcBorders>
+              <w:top w:val="single" w:color="BBCFE0" w:sz="1"/>
+              <w:left w:val="single" w:color="BBCFE0" w:sz="1"/>
+              <w:bottom w:val="single" w:color="BBCFE0" w:sz="1"/>
+              <w:right w:val="single" w:color="BBCFE0" w:sz="1"/>
+            </w:tcBorders>
+            <w:shd w:fill="FFFFFF" w:val="clear"/>
+            <w:tcMar>
+              <w:top w:type="dxa" w:w="80"/>
+              <w:left w:type="dxa" w:w="160"/>
+              <w:bottom w:type="dxa" w:w="80"/>
+              <w:right w:type="dxa" w:w="160"/>
+            </w:tcMar>
+          </w:tcPr>
+          <w:p>
+            <w:r>
+              <w:rPr>
+                <w:rFonts w:ascii="Arial" w:hAnsi="Arial"/>
+                <w:b w:val="0"/>
+                <w:color w:val="2C2C2C"/>
+                <w:sz w:val="20"/>
+              </w:rPr>
+              <w:t>B — thesis_19 oluşturuldu. inv_p99 birimi tick → lot olarak düzeltildi. sigma_only vs oracle_full p-değeri 0.301 → 0.115 olarak düzeltildi (stats_ablation.txt: ppo_sigma_only vs ppo_oracle_full sharpe_like p=1.15e-01).</w:t>
+            </w:r>
+          </w:p>
+        </w:tc>
+      </w:tr>
+      <w:tr>
+        <w:tc>
+          <w:tcPr>
+            <w:tcW w:w="1400" w:type="dxa"/>
+            <w:tcBorders>
+              <w:top w:val="single" w:color="BBCFE0" w:sz="1"/>
+              <w:left w:val="single" w:color="BBCFE0" w:sz="1"/>
+              <w:bottom w:val="single" w:color="BBCFE0" w:sz="1"/>
+              <w:right w:val="single" w:color="BBCFE0" w:sz="1"/>
+            </w:tcBorders>
+            <w:shd w:fill="E8F4FD" w:val="clear"/>
+            <w:tcMar>
+              <w:top w:type="dxa" w:w="80"/>
+              <w:left w:type="dxa" w:w="160"/>
+              <w:bottom w:type="dxa" w:w="80"/>
+              <w:right w:type="dxa" w:w="160"/>
+            </w:tcMar>
+          </w:tcPr>
+          <w:p>
+            <w:r>
+              <w:rPr>
+                <w:rFonts w:ascii="Arial" w:hAnsi="Arial"/>
+                <w:b/>
+                <w:color w:val="1F4E79"/>
+                <w:sz w:val="20"/>
+              </w:rPr>
+              <w:t>Neden</w:t>
+            </w:r>
+          </w:p>
+        </w:tc>
+        <w:tc>
+          <w:tcPr>
+            <w:tcW w:w="6960" w:type="dxa"/>
+            <w:tcBorders>
+              <w:top w:val="single" w:color="BBCFE0" w:sz="1"/>
+              <w:left w:val="single" w:color="BBCFE0" w:sz="1"/>
+              <w:bottom w:val="single" w:color="BBCFE0" w:sz="1"/>
+              <w:right w:val="single" w:color="BBCFE0" w:sz="1"/>
+            </w:tcBorders>
+            <w:shd w:fill="FFFFFF" w:val="clear"/>
+            <w:tcMar>
+              <w:top w:type="dxa" w:w="80"/>
+              <w:left w:type="dxa" w:w="160"/>
+              <w:bottom w:type="dxa" w:w="80"/>
+              <w:right w:type="dxa" w:w="160"/>
+            </w:tcMar>
+          </w:tcPr>
+          <w:p>
+            <w:r>
+              <w:rPr>
+                <w:rFonts w:ascii="Arial" w:hAnsi="Arial"/>
+                <w:b w:val="0"/>
+                <w:color w:val="2C2C2C"/>
+                <w:sz w:val="20"/>
+              </w:rPr>
+              <w:t>inv_p99 envanter pozisyon büyüklüğünü ölçer — birimi lot/kontrat, tick değil. p=0.301, oracle_full vs combined karşılaştırmasına aittir; sigma_only vs oracle_full Sharpe p-değeri 0.115'tir.</w:t>
+            </w:r>
+          </w:p>
+        </w:tc>
+      </w:tr>
+      <w:tr>
+        <w:tc>
+          <w:tcPr>
+            <w:tcW w:w="1400" w:type="dxa"/>
+            <w:tcBorders>
+              <w:top w:val="single" w:color="BBCFE0" w:sz="1"/>
+              <w:left w:val="single" w:color="BBCFE0" w:sz="1"/>
+              <w:bottom w:val="single" w:color="BBCFE0" w:sz="1"/>
+              <w:right w:val="single" w:color="BBCFE0" w:sz="1"/>
+            </w:tcBorders>
+            <w:shd w:fill="E8F4FD" w:val="clear"/>
+            <w:tcMar>
+              <w:top w:type="dxa" w:w="80"/>
+              <w:left w:type="dxa" w:w="160"/>
+              <w:bottom w:type="dxa" w:w="80"/>
+              <w:right w:type="dxa" w:w="160"/>
+            </w:tcMar>
+          </w:tcPr>
+          <w:p>
+            <w:r>
+              <w:rPr>
+                <w:rFonts w:ascii="Arial" w:hAnsi="Arial"/>
+                <w:b/>
+                <w:color w:val="1F4E79"/>
+                <w:sz w:val="20"/>
+              </w:rPr>
+              <w:t>Etki</w:t>
+            </w:r>
+          </w:p>
+        </w:tc>
+        <w:tc>
+          <w:tcPr>
+            <w:tcW w:w="6960" w:type="dxa"/>
+            <w:tcBorders>
+              <w:top w:val="single" w:color="BBCFE0" w:sz="1"/>
+              <w:left w:val="single" w:color="BBCFE0" w:sz="1"/>
+              <w:bottom w:val="single" w:color="BBCFE0" w:sz="1"/>
+              <w:right w:val="single" w:color="BBCFE0" w:sz="1"/>
+            </w:tcBorders>
+            <w:shd w:fill="FFFFFF" w:val="clear"/>
+            <w:tcMar>
+              <w:top w:type="dxa" w:w="80"/>
+              <w:left w:type="dxa" w:w="160"/>
+              <w:bottom w:type="dxa" w:w="80"/>
+              <w:right w:type="dxa" w:w="160"/>
+            </w:tcMar>
+          </w:tcPr>
+          <w:p>
+            <w:r>
+              <w:rPr>
+                <w:rFonts w:ascii="Arial" w:hAnsi="Arial"/>
+                <w:b w:val="0"/>
+                <w:color w:val="2C2C2C"/>
+                <w:sz w:val="20"/>
+              </w:rPr>
+              <w:t>İki faktüel hata giderildi; tez argümanı değişmedi, yalnızca raporlama doğruluğu artırıldı.</w:t>
+            </w:r>
+          </w:p>
+        </w:tc>
+      </w:tr>
+    </w:tbl>
+    <w:p/>
+    <w:tbl>
+      <w:tblPr>
+        <w:tblW w:type="auto" w:w="0"/>
+        <w:tblLook w:firstColumn="1" w:firstRow="1" w:lastColumn="0" w:lastRow="0" w:noHBand="0" w:noVBand="1" w:val="04A0"/>
+      </w:tblPr>
+      <w:tblGrid>
+        <w:gridCol w:w="4873"/>
+        <w:gridCol w:w="4873"/>
+      </w:tblGrid>
+      <w:tr>
+        <w:tc>
+          <w:tcPr>
+            <w:tcW w:w="1400" w:type="dxa"/>
+            <w:tcBorders>
+              <w:top w:val="single" w:color="BBCFE0" w:sz="1"/>
+              <w:left w:val="single" w:color="BBCFE0" w:sz="1"/>
+              <w:bottom w:val="single" w:color="BBCFE0" w:sz="1"/>
+              <w:right w:val="single" w:color="BBCFE0" w:sz="1"/>
+            </w:tcBorders>
+            <w:shd w:fill="1F4E79" w:val="clear"/>
+            <w:tcMar>
+              <w:top w:type="dxa" w:w="80"/>
+              <w:left w:type="dxa" w:w="160"/>
+              <w:bottom w:type="dxa" w:w="80"/>
+              <w:right w:type="dxa" w:w="160"/>
+            </w:tcMar>
+          </w:tcPr>
+          <w:p>
+            <w:r>
+              <w:rPr>
+                <w:rFonts w:ascii="Arial" w:hAnsi="Arial"/>
+                <w:b/>
+                <w:color w:val="FFFFFF"/>
+                <w:sz w:val="20"/>
+              </w:rPr>
+              <w:t>WP5</w:t>
+            </w:r>
+          </w:p>
+        </w:tc>
+        <w:tc>
+          <w:tcPr>
+            <w:tcW w:w="6960" w:type="dxa"/>
+            <w:tcBorders>
+              <w:top w:val="single" w:color="BBCFE0" w:sz="1"/>
+              <w:left w:val="single" w:color="BBCFE0" w:sz="1"/>
+              <w:bottom w:val="single" w:color="BBCFE0" w:sz="1"/>
+              <w:right w:val="single" w:color="BBCFE0" w:sz="1"/>
+            </w:tcBorders>
+            <w:shd w:fill="1F4E79" w:val="clear"/>
+            <w:tcMar>
+              <w:top w:type="dxa" w:w="80"/>
+              <w:left w:type="dxa" w:w="160"/>
+              <w:bottom w:type="dxa" w:w="80"/>
+              <w:right w:type="dxa" w:w="160"/>
+            </w:tcMar>
+          </w:tcPr>
+          <w:p>
+            <w:r>
+              <w:rPr>
+                <w:rFonts w:ascii="Arial" w:hAnsi="Arial"/>
+                <w:b/>
+                <w:color w:val="FFFFFF"/>
+                <w:sz w:val="22"/>
+              </w:rPr>
+              <w:t>#37  thesis_20 — Tablo 3 Bonferroni Düzeltmesi</w:t>
+            </w:r>
+          </w:p>
+        </w:tc>
+      </w:tr>
+      <w:tr>
+        <w:tc>
+          <w:tcPr>
+            <w:tcW w:w="1400" w:type="dxa"/>
+            <w:tcBorders>
+              <w:top w:val="single" w:color="BBCFE0" w:sz="1"/>
+              <w:left w:val="single" w:color="BBCFE0" w:sz="1"/>
+              <w:bottom w:val="single" w:color="BBCFE0" w:sz="1"/>
+              <w:right w:val="single" w:color="BBCFE0" w:sz="1"/>
+            </w:tcBorders>
+            <w:shd w:fill="E8F4FD" w:val="clear"/>
+            <w:tcMar>
+              <w:top w:type="dxa" w:w="80"/>
+              <w:left w:type="dxa" w:w="160"/>
+              <w:bottom w:type="dxa" w:w="80"/>
+              <w:right w:type="dxa" w:w="160"/>
+            </w:tcMar>
+          </w:tcPr>
+          <w:p>
+            <w:r>
+              <w:rPr>
+                <w:rFonts w:ascii="Arial" w:hAnsi="Arial"/>
+                <w:b/>
+                <w:color w:val="1F4E79"/>
+                <w:sz w:val="20"/>
+              </w:rPr>
+              <w:t>İkilem</w:t>
+            </w:r>
+          </w:p>
+        </w:tc>
+        <w:tc>
+          <w:tcPr>
+            <w:tcW w:w="6960" w:type="dxa"/>
+            <w:tcBorders>
+              <w:top w:val="single" w:color="BBCFE0" w:sz="1"/>
+              <w:left w:val="single" w:color="BBCFE0" w:sz="1"/>
+              <w:bottom w:val="single" w:color="BBCFE0" w:sz="1"/>
+              <w:right w:val="single" w:color="BBCFE0" w:sz="1"/>
+            </w:tcBorders>
+            <w:shd w:fill="FFFFFF" w:val="clear"/>
+            <w:tcMar>
+              <w:top w:type="dxa" w:w="80"/>
+              <w:left w:type="dxa" w:w="160"/>
+              <w:bottom w:type="dxa" w:w="80"/>
+              <w:right w:type="dxa" w:w="160"/>
+            </w:tcMar>
+          </w:tcPr>
+          <w:p>
+            <w:r>
+              <w:rPr>
+                <w:rFonts w:ascii="Arial" w:hAnsi="Arial"/>
+                <w:b w:val="0"/>
+                <w:color w:val="2C2C2C"/>
+                <w:sz w:val="20"/>
+              </w:rPr>
+              <w:t>thesis_19 Tablo 3'te 10 karşılaştırma rapor edilmiş ancak combined vs AS ve combined vs naive equity satırları eksikti. Bonferroni α = 0.01/10 = 0.001 olarak yazılmıştı.</w:t>
+            </w:r>
+          </w:p>
+        </w:tc>
+      </w:tr>
+      <w:tr>
+        <w:tc>
+          <w:tcPr>
+            <w:tcW w:w="1400" w:type="dxa"/>
+            <w:tcBorders>
+              <w:top w:val="single" w:color="BBCFE0" w:sz="1"/>
+              <w:left w:val="single" w:color="BBCFE0" w:sz="1"/>
+              <w:bottom w:val="single" w:color="BBCFE0" w:sz="1"/>
+              <w:right w:val="single" w:color="BBCFE0" w:sz="1"/>
+            </w:tcBorders>
+            <w:shd w:fill="E8F4FD" w:val="clear"/>
+            <w:tcMar>
+              <w:top w:type="dxa" w:w="80"/>
+              <w:left w:type="dxa" w:w="160"/>
+              <w:bottom w:type="dxa" w:w="80"/>
+              <w:right w:type="dxa" w:w="160"/>
+            </w:tcMar>
+          </w:tcPr>
+          <w:p>
+            <w:r>
+              <w:rPr>
+                <w:rFonts w:ascii="Arial" w:hAnsi="Arial"/>
+                <w:b/>
+                <w:color w:val="1F4E79"/>
+                <w:sz w:val="20"/>
+              </w:rPr>
+              <w:t>Seçenekler</w:t>
+            </w:r>
+          </w:p>
+        </w:tc>
+        <w:tc>
+          <w:tcPr>
+            <w:tcW w:w="6960" w:type="dxa"/>
+            <w:tcBorders>
+              <w:top w:val="single" w:color="BBCFE0" w:sz="1"/>
+              <w:left w:val="single" w:color="BBCFE0" w:sz="1"/>
+              <w:bottom w:val="single" w:color="BBCFE0" w:sz="1"/>
+              <w:right w:val="single" w:color="BBCFE0" w:sz="1"/>
+            </w:tcBorders>
+            <w:shd w:fill="FFFFFF" w:val="clear"/>
+            <w:tcMar>
+              <w:top w:type="dxa" w:w="80"/>
+              <w:left w:type="dxa" w:w="160"/>
+              <w:bottom w:type="dxa" w:w="80"/>
+              <w:right w:type="dxa" w:w="160"/>
+            </w:tcMar>
+          </w:tcPr>
+          <w:p>
+            <w:r>
+              <w:rPr>
+                <w:rFonts w:ascii="Arial" w:hAnsi="Arial"/>
+                <w:b w:val="0"/>
+                <w:color w:val="2C2C2C"/>
+                <w:sz w:val="20"/>
+              </w:rPr>
+              <w:t>A) Sadece metin düzelt, tabloyu 10 satır bırak  |  B) Eksik 2 equity satırını ekle, Bonferroni'yi 12'ye güncelle</w:t>
+            </w:r>
+          </w:p>
+        </w:tc>
+      </w:tr>
+      <w:tr>
+        <w:tc>
+          <w:tcPr>
+            <w:tcW w:w="1400" w:type="dxa"/>
+            <w:tcBorders>
+              <w:top w:val="single" w:color="BBCFE0" w:sz="1"/>
+              <w:left w:val="single" w:color="BBCFE0" w:sz="1"/>
+              <w:bottom w:val="single" w:color="BBCFE0" w:sz="1"/>
+              <w:right w:val="single" w:color="BBCFE0" w:sz="1"/>
+            </w:tcBorders>
+            <w:shd w:fill="E8F4FD" w:val="clear"/>
+            <w:tcMar>
+              <w:top w:type="dxa" w:w="80"/>
+              <w:left w:type="dxa" w:w="160"/>
+              <w:bottom w:type="dxa" w:w="80"/>
+              <w:right w:type="dxa" w:w="160"/>
+            </w:tcMar>
+          </w:tcPr>
+          <w:p>
+            <w:r>
+              <w:rPr>
+                <w:rFonts w:ascii="Arial" w:hAnsi="Arial"/>
+                <w:b/>
+                <w:color w:val="1F4E79"/>
+                <w:sz w:val="20"/>
+              </w:rPr>
+              <w:t>Karar</w:t>
+            </w:r>
+          </w:p>
+        </w:tc>
+        <w:tc>
+          <w:tcPr>
+            <w:tcW w:w="6960" w:type="dxa"/>
+            <w:tcBorders>
+              <w:top w:val="single" w:color="BBCFE0" w:sz="1"/>
+              <w:left w:val="single" w:color="BBCFE0" w:sz="1"/>
+              <w:bottom w:val="single" w:color="BBCFE0" w:sz="1"/>
+              <w:right w:val="single" w:color="BBCFE0" w:sz="1"/>
+            </w:tcBorders>
+            <w:shd w:fill="FFFFFF" w:val="clear"/>
+            <w:tcMar>
+              <w:top w:type="dxa" w:w="80"/>
+              <w:left w:type="dxa" w:w="160"/>
+              <w:bottom w:type="dxa" w:w="80"/>
+              <w:right w:type="dxa" w:w="160"/>
+            </w:tcMar>
+          </w:tcPr>
+          <w:p>
+            <w:r>
+              <w:rPr>
+                <w:rFonts w:ascii="Arial" w:hAnsi="Arial"/>
+                <w:b w:val="0"/>
+                <w:color w:val="2C2C2C"/>
+                <w:sz w:val="20"/>
+              </w:rPr>
+              <w:t>B — Tablo 3'e combined vs AS (final_equity, t=-1.064, p=3.01e-01) ve combined vs naive (final_equity, t=-0.728, p=4.76e-01) satırları eklendi. Bonferroni düzeltmesi 10→12 karşılaştırma, α = 0.01/12 = 0.00083 olarak güncellendi.</w:t>
+            </w:r>
+          </w:p>
+        </w:tc>
+      </w:tr>
+      <w:tr>
+        <w:tc>
+          <w:tcPr>
+            <w:tcW w:w="1400" w:type="dxa"/>
+            <w:tcBorders>
+              <w:top w:val="single" w:color="BBCFE0" w:sz="1"/>
+              <w:left w:val="single" w:color="BBCFE0" w:sz="1"/>
+              <w:bottom w:val="single" w:color="BBCFE0" w:sz="1"/>
+              <w:right w:val="single" w:color="BBCFE0" w:sz="1"/>
+            </w:tcBorders>
+            <w:shd w:fill="E8F4FD" w:val="clear"/>
+            <w:tcMar>
+              <w:top w:type="dxa" w:w="80"/>
+              <w:left w:type="dxa" w:w="160"/>
+              <w:bottom w:type="dxa" w:w="80"/>
+              <w:right w:type="dxa" w:w="160"/>
+            </w:tcMar>
+          </w:tcPr>
+          <w:p>
+            <w:r>
+              <w:rPr>
+                <w:rFonts w:ascii="Arial" w:hAnsi="Arial"/>
+                <w:b/>
+                <w:color w:val="1F4E79"/>
+                <w:sz w:val="20"/>
+              </w:rPr>
+              <w:t>Neden</w:t>
+            </w:r>
+          </w:p>
+        </w:tc>
+        <w:tc>
+          <w:tcPr>
+            <w:tcW w:w="6960" w:type="dxa"/>
+            <w:tcBorders>
+              <w:top w:val="single" w:color="BBCFE0" w:sz="1"/>
+              <w:left w:val="single" w:color="BBCFE0" w:sz="1"/>
+              <w:bottom w:val="single" w:color="BBCFE0" w:sz="1"/>
+              <w:right w:val="single" w:color="BBCFE0" w:sz="1"/>
+            </w:tcBorders>
+            <w:shd w:fill="FFFFFF" w:val="clear"/>
+            <w:tcMar>
+              <w:top w:type="dxa" w:w="80"/>
+              <w:left w:type="dxa" w:w="160"/>
+              <w:bottom w:type="dxa" w:w="80"/>
+              <w:right w:type="dxa" w:w="160"/>
+            </w:tcMar>
+          </w:tcPr>
+          <w:p>
+            <w:r>
+              <w:rPr>
+                <w:rFonts w:ascii="Arial" w:hAnsi="Arial"/>
+                <w:b w:val="0"/>
+                <w:color w:val="2C2C2C"/>
+                <w:sz w:val="20"/>
+              </w:rPr>
+              <w:t>stats_ablation.txt'te 12 karşılaştırma mevcuttur; tablo ile kaynak arasındaki tutarsızlık giderildi. Yeni equity satırları 'Hayır' (anlamsız) olduğundan sonuçlar değişmedi, yalnızca raporlama bütünlüğü sağlandı.</w:t>
+            </w:r>
+          </w:p>
+        </w:tc>
+      </w:tr>
+      <w:tr>
+        <w:tc>
+          <w:tcPr>
+            <w:tcW w:w="1400" w:type="dxa"/>
+            <w:tcBorders>
+              <w:top w:val="single" w:color="BBCFE0" w:sz="1"/>
+              <w:left w:val="single" w:color="BBCFE0" w:sz="1"/>
+              <w:bottom w:val="single" w:color="BBCFE0" w:sz="1"/>
+              <w:right w:val="single" w:color="BBCFE0" w:sz="1"/>
+            </w:tcBorders>
+            <w:shd w:fill="E8F4FD" w:val="clear"/>
+            <w:tcMar>
+              <w:top w:type="dxa" w:w="80"/>
+              <w:left w:type="dxa" w:w="160"/>
+              <w:bottom w:type="dxa" w:w="80"/>
+              <w:right w:type="dxa" w:w="160"/>
+            </w:tcMar>
+          </w:tcPr>
+          <w:p>
+            <w:r>
+              <w:rPr>
+                <w:rFonts w:ascii="Arial" w:hAnsi="Arial"/>
+                <w:b/>
+                <w:color w:val="1F4E79"/>
+                <w:sz w:val="20"/>
+              </w:rPr>
+              <w:t>Etki</w:t>
+            </w:r>
+          </w:p>
+        </w:tc>
+        <w:tc>
+          <w:tcPr>
+            <w:tcW w:w="6960" w:type="dxa"/>
+            <w:tcBorders>
+              <w:top w:val="single" w:color="BBCFE0" w:sz="1"/>
+              <w:left w:val="single" w:color="BBCFE0" w:sz="1"/>
+              <w:bottom w:val="single" w:color="BBCFE0" w:sz="1"/>
+              <w:right w:val="single" w:color="BBCFE0" w:sz="1"/>
+            </w:tcBorders>
+            <w:shd w:fill="FFFFFF" w:val="clear"/>
+            <w:tcMar>
+              <w:top w:type="dxa" w:w="80"/>
+              <w:left w:type="dxa" w:w="160"/>
+              <w:bottom w:type="dxa" w:w="80"/>
+              <w:right w:type="dxa" w:w="160"/>
+            </w:tcMar>
+          </w:tcPr>
+          <w:p>
+            <w:r>
+              <w:rPr>
+                <w:rFonts w:ascii="Arial" w:hAnsi="Arial"/>
+                <w:b w:val="0"/>
+                <w:color w:val="2C2C2C"/>
+                <w:sz w:val="20"/>
+              </w:rPr>
+              <w:t>Tablo 3 artık stats_ablation.txt ile birebir uyumlu; Bonferroni eşiği daha muhafazakâr hale geldi (0.001→0.00083).</w:t>
+            </w:r>
+          </w:p>
+        </w:tc>
+      </w:tr>
+    </w:tbl>
+    <w:p/>
+    <w:tbl>
+      <w:tblPr>
+        <w:tblW w:type="auto" w:w="0"/>
+        <w:tblLook w:firstColumn="1" w:firstRow="1" w:lastColumn="0" w:lastRow="0" w:noHBand="0" w:noVBand="1" w:val="04A0"/>
+      </w:tblPr>
+      <w:tblGrid>
+        <w:gridCol w:w="4873"/>
+        <w:gridCol w:w="4873"/>
+      </w:tblGrid>
+      <w:tr>
+        <w:tc>
+          <w:tcPr>
+            <w:tcW w:w="1400" w:type="dxa"/>
+            <w:tcBorders>
+              <w:top w:val="single" w:color="BBCFE0" w:sz="1"/>
+              <w:left w:val="single" w:color="BBCFE0" w:sz="1"/>
+              <w:bottom w:val="single" w:color="BBCFE0" w:sz="1"/>
+              <w:right w:val="single" w:color="BBCFE0" w:sz="1"/>
+            </w:tcBorders>
+            <w:shd w:fill="1F4E79" w:val="clear"/>
+            <w:tcMar>
+              <w:top w:type="dxa" w:w="80"/>
+              <w:left w:type="dxa" w:w="160"/>
+              <w:bottom w:type="dxa" w:w="80"/>
+              <w:right w:type="dxa" w:w="160"/>
+            </w:tcMar>
+          </w:tcPr>
+          <w:p>
+            <w:r>
+              <w:rPr>
+                <w:rFonts w:ascii="Arial" w:hAnsi="Arial"/>
+                <w:b/>
+                <w:color w:val="FFFFFF"/>
+                <w:sz w:val="20"/>
+              </w:rPr>
+              <w:t>WP5</w:t>
+            </w:r>
+          </w:p>
+        </w:tc>
+        <w:tc>
+          <w:tcPr>
+            <w:tcW w:w="6960" w:type="dxa"/>
+            <w:tcBorders>
+              <w:top w:val="single" w:color="BBCFE0" w:sz="1"/>
+              <w:left w:val="single" w:color="BBCFE0" w:sz="1"/>
+              <w:bottom w:val="single" w:color="BBCFE0" w:sz="1"/>
+              <w:right w:val="single" w:color="BBCFE0" w:sz="1"/>
+            </w:tcBorders>
+            <w:shd w:fill="1F4E79" w:val="clear"/>
+            <w:tcMar>
+              <w:top w:type="dxa" w:w="80"/>
+              <w:left w:type="dxa" w:w="160"/>
+              <w:bottom w:type="dxa" w:w="80"/>
+              <w:right w:type="dxa" w:w="160"/>
+            </w:tcMar>
+          </w:tcPr>
+          <w:p>
+            <w:r>
+              <w:rPr>
+                <w:rFonts w:ascii="Arial" w:hAnsi="Arial"/>
+                <w:b/>
+                <w:color w:val="FFFFFF"/>
+                <w:sz w:val="22"/>
+              </w:rPr>
+              <w:t>#38  thesis_21 — Sec 4.7 Varyant, Tablo 7 Sütun, Oracle Paradox Güncelleme</w:t>
+            </w:r>
+          </w:p>
+        </w:tc>
+      </w:tr>
+      <w:tr>
+        <w:tc>
+          <w:tcPr>
+            <w:tcW w:w="1400" w:type="dxa"/>
+            <w:tcBorders>
+              <w:top w:val="single" w:color="BBCFE0" w:sz="1"/>
+              <w:left w:val="single" w:color="BBCFE0" w:sz="1"/>
+              <w:bottom w:val="single" w:color="BBCFE0" w:sz="1"/>
+              <w:right w:val="single" w:color="BBCFE0" w:sz="1"/>
+            </w:tcBorders>
+            <w:shd w:fill="E8F4FD" w:val="clear"/>
+            <w:tcMar>
+              <w:top w:type="dxa" w:w="80"/>
+              <w:left w:type="dxa" w:w="160"/>
+              <w:bottom w:type="dxa" w:w="80"/>
+              <w:right w:type="dxa" w:w="160"/>
+            </w:tcMar>
+          </w:tcPr>
+          <w:p>
+            <w:r>
+              <w:rPr>
+                <w:rFonts w:ascii="Arial" w:hAnsi="Arial"/>
+                <w:b/>
+                <w:color w:val="1F4E79"/>
+                <w:sz w:val="20"/>
+              </w:rPr>
+              <w:t>İkilem</w:t>
+            </w:r>
+          </w:p>
+        </w:tc>
+        <w:tc>
+          <w:tcPr>
+            <w:tcW w:w="6960" w:type="dxa"/>
+            <w:tcBorders>
+              <w:top w:val="single" w:color="BBCFE0" w:sz="1"/>
+              <w:left w:val="single" w:color="BBCFE0" w:sz="1"/>
+              <w:bottom w:val="single" w:color="BBCFE0" w:sz="1"/>
+              <w:right w:val="single" w:color="BBCFE0" w:sz="1"/>
+            </w:tcBorders>
+            <w:shd w:fill="FFFFFF" w:val="clear"/>
+            <w:tcMar>
+              <w:top w:type="dxa" w:w="80"/>
+              <w:left w:type="dxa" w:w="160"/>
+              <w:bottom w:type="dxa" w:w="80"/>
+              <w:right w:type="dxa" w:w="160"/>
+            </w:tcMar>
+          </w:tcPr>
+          <w:p>
+            <w:r>
+              <w:rPr>
+                <w:rFonts w:ascii="Arial" w:hAnsi="Arial"/>
+                <w:b w:val="0"/>
+                <w:color w:val="2C2C2C"/>
+                <w:sz w:val="20"/>
+              </w:rPr>
+              <w:t>thesis_20'de üç sorun tespit edildi: (1) Section 4.7'de 'üç varyant' yazılmış, doğrusu beş varyant; (2) Tablo 7'de 'Std Sharpe' sütunu tüm değerleri '—' iken gereksiz; (3) Abstract ve Conclusion'da oracle paradox, oracle_full vs combined p=0.301 üzerinden ifade edilmiş — daha doğrudan kanıt sigma_only vs oracle_full p=0.115'tir.</w:t>
+            </w:r>
+          </w:p>
+        </w:tc>
+      </w:tr>
+      <w:tr>
+        <w:tc>
+          <w:tcPr>
+            <w:tcW w:w="1400" w:type="dxa"/>
+            <w:tcBorders>
+              <w:top w:val="single" w:color="BBCFE0" w:sz="1"/>
+              <w:left w:val="single" w:color="BBCFE0" w:sz="1"/>
+              <w:bottom w:val="single" w:color="BBCFE0" w:sz="1"/>
+              <w:right w:val="single" w:color="BBCFE0" w:sz="1"/>
+            </w:tcBorders>
+            <w:shd w:fill="E8F4FD" w:val="clear"/>
+            <w:tcMar>
+              <w:top w:type="dxa" w:w="80"/>
+              <w:left w:type="dxa" w:w="160"/>
+              <w:bottom w:type="dxa" w:w="80"/>
+              <w:right w:type="dxa" w:w="160"/>
+            </w:tcMar>
+          </w:tcPr>
+          <w:p>
+            <w:r>
+              <w:rPr>
+                <w:rFonts w:ascii="Arial" w:hAnsi="Arial"/>
+                <w:b/>
+                <w:color w:val="1F4E79"/>
+                <w:sz w:val="20"/>
+              </w:rPr>
+              <w:t>Seçenekler</w:t>
+            </w:r>
+          </w:p>
+        </w:tc>
+        <w:tc>
+          <w:tcPr>
+            <w:tcW w:w="6960" w:type="dxa"/>
+            <w:tcBorders>
+              <w:top w:val="single" w:color="BBCFE0" w:sz="1"/>
+              <w:left w:val="single" w:color="BBCFE0" w:sz="1"/>
+              <w:bottom w:val="single" w:color="BBCFE0" w:sz="1"/>
+              <w:right w:val="single" w:color="BBCFE0" w:sz="1"/>
+            </w:tcBorders>
+            <w:shd w:fill="FFFFFF" w:val="clear"/>
+            <w:tcMar>
+              <w:top w:type="dxa" w:w="80"/>
+              <w:left w:type="dxa" w:w="160"/>
+              <w:bottom w:type="dxa" w:w="80"/>
+              <w:right w:type="dxa" w:w="160"/>
+            </w:tcMar>
+          </w:tcPr>
+          <w:p>
+            <w:r>
+              <w:rPr>
+                <w:rFonts w:ascii="Arial" w:hAnsi="Arial"/>
+                <w:b w:val="0"/>
+                <w:color w:val="2C2C2C"/>
+                <w:sz w:val="20"/>
+              </w:rPr>
+              <w:t>A) Küçük düzeltmeleri atla  |  B) Üçünü birden düzelt, thesis_21 oluştur</w:t>
+            </w:r>
+          </w:p>
+        </w:tc>
+      </w:tr>
+      <w:tr>
+        <w:tc>
+          <w:tcPr>
+            <w:tcW w:w="1400" w:type="dxa"/>
+            <w:tcBorders>
+              <w:top w:val="single" w:color="BBCFE0" w:sz="1"/>
+              <w:left w:val="single" w:color="BBCFE0" w:sz="1"/>
+              <w:bottom w:val="single" w:color="BBCFE0" w:sz="1"/>
+              <w:right w:val="single" w:color="BBCFE0" w:sz="1"/>
+            </w:tcBorders>
+            <w:shd w:fill="E8F4FD" w:val="clear"/>
+            <w:tcMar>
+              <w:top w:type="dxa" w:w="80"/>
+              <w:left w:type="dxa" w:w="160"/>
+              <w:bottom w:type="dxa" w:w="80"/>
+              <w:right w:type="dxa" w:w="160"/>
+            </w:tcMar>
+          </w:tcPr>
+          <w:p>
+            <w:r>
+              <w:rPr>
+                <w:rFonts w:ascii="Arial" w:hAnsi="Arial"/>
+                <w:b/>
+                <w:color w:val="1F4E79"/>
+                <w:sz w:val="20"/>
+              </w:rPr>
+              <w:t>Karar</w:t>
+            </w:r>
+          </w:p>
+        </w:tc>
+        <w:tc>
+          <w:tcPr>
+            <w:tcW w:w="6960" w:type="dxa"/>
+            <w:tcBorders>
+              <w:top w:val="single" w:color="BBCFE0" w:sz="1"/>
+              <w:left w:val="single" w:color="BBCFE0" w:sz="1"/>
+              <w:bottom w:val="single" w:color="BBCFE0" w:sz="1"/>
+              <w:right w:val="single" w:color="BBCFE0" w:sz="1"/>
+            </w:tcBorders>
+            <w:shd w:fill="FFFFFF" w:val="clear"/>
+            <w:tcMar>
+              <w:top w:type="dxa" w:w="80"/>
+              <w:left w:type="dxa" w:w="160"/>
+              <w:bottom w:type="dxa" w:w="80"/>
+              <w:right w:type="dxa" w:w="160"/>
+            </w:tcMar>
+          </w:tcPr>
+          <w:p>
+            <w:r>
+              <w:rPr>
+                <w:rFonts w:ascii="Arial" w:hAnsi="Arial"/>
+                <w:b w:val="0"/>
+                <w:color w:val="2C2C2C"/>
+                <w:sz w:val="20"/>
+              </w:rPr>
+              <w:t>B — (1) 'üç varyant' → 'beş varyant'; (2) Tablo 7'den Std Sharpe sütunu kaldırıldı; (3) Abstract ve Conclusion'da oracle paradox cümlesi sigma_only vs oracle_full p=0.115 ifadesiyle güncellendi.</w:t>
+            </w:r>
+          </w:p>
+        </w:tc>
+      </w:tr>
+      <w:tr>
+        <w:tc>
+          <w:tcPr>
+            <w:tcW w:w="1400" w:type="dxa"/>
+            <w:tcBorders>
+              <w:top w:val="single" w:color="BBCFE0" w:sz="1"/>
+              <w:left w:val="single" w:color="BBCFE0" w:sz="1"/>
+              <w:bottom w:val="single" w:color="BBCFE0" w:sz="1"/>
+              <w:right w:val="single" w:color="BBCFE0" w:sz="1"/>
+            </w:tcBorders>
+            <w:shd w:fill="E8F4FD" w:val="clear"/>
+            <w:tcMar>
+              <w:top w:type="dxa" w:w="80"/>
+              <w:left w:type="dxa" w:w="160"/>
+              <w:bottom w:type="dxa" w:w="80"/>
+              <w:right w:type="dxa" w:w="160"/>
+            </w:tcMar>
+          </w:tcPr>
+          <w:p>
+            <w:r>
+              <w:rPr>
+                <w:rFonts w:ascii="Arial" w:hAnsi="Arial"/>
+                <w:b/>
+                <w:color w:val="1F4E79"/>
+                <w:sz w:val="20"/>
+              </w:rPr>
+              <w:t>Neden</w:t>
+            </w:r>
+          </w:p>
+        </w:tc>
+        <w:tc>
+          <w:tcPr>
+            <w:tcW w:w="6960" w:type="dxa"/>
+            <w:tcBorders>
+              <w:top w:val="single" w:color="BBCFE0" w:sz="1"/>
+              <w:left w:val="single" w:color="BBCFE0" w:sz="1"/>
+              <w:bottom w:val="single" w:color="BBCFE0" w:sz="1"/>
+              <w:right w:val="single" w:color="BBCFE0" w:sz="1"/>
+            </w:tcBorders>
+            <w:shd w:fill="FFFFFF" w:val="clear"/>
+            <w:tcMar>
+              <w:top w:type="dxa" w:w="80"/>
+              <w:left w:type="dxa" w:w="160"/>
+              <w:bottom w:type="dxa" w:w="80"/>
+              <w:right w:type="dxa" w:w="160"/>
+            </w:tcMar>
+          </w:tcPr>
+          <w:p>
+            <w:r>
+              <w:rPr>
+                <w:rFonts w:ascii="Arial" w:hAnsi="Arial"/>
+                <w:b w:val="0"/>
+                <w:color w:val="2C2C2C"/>
+                <w:sz w:val="20"/>
+              </w:rPr>
+              <w:t>Beş varyant fiilen eğitilmiştir (sigma_only, combined, oracle_full, oracle_pure, regime_only). Std Sharpe sütunu bilgi taşımıyordu. p=0.115 doğrudan sigma_only vs oracle_full karşılaştırmasını yansıtır ve oracle paradox argümanını daha güçlü destekler.</w:t>
+            </w:r>
+          </w:p>
+        </w:tc>
+      </w:tr>
+      <w:tr>
+        <w:tc>
+          <w:tcPr>
+            <w:tcW w:w="1400" w:type="dxa"/>
+            <w:tcBorders>
+              <w:top w:val="single" w:color="BBCFE0" w:sz="1"/>
+              <w:left w:val="single" w:color="BBCFE0" w:sz="1"/>
+              <w:bottom w:val="single" w:color="BBCFE0" w:sz="1"/>
+              <w:right w:val="single" w:color="BBCFE0" w:sz="1"/>
+            </w:tcBorders>
+            <w:shd w:fill="E8F4FD" w:val="clear"/>
+            <w:tcMar>
+              <w:top w:type="dxa" w:w="80"/>
+              <w:left w:type="dxa" w:w="160"/>
+              <w:bottom w:type="dxa" w:w="80"/>
+              <w:right w:type="dxa" w:w="160"/>
+            </w:tcMar>
+          </w:tcPr>
+          <w:p>
+            <w:r>
+              <w:rPr>
+                <w:rFonts w:ascii="Arial" w:hAnsi="Arial"/>
+                <w:b/>
+                <w:color w:val="1F4E79"/>
+                <w:sz w:val="20"/>
+              </w:rPr>
+              <w:t>Etki</w:t>
+            </w:r>
+          </w:p>
+        </w:tc>
+        <w:tc>
+          <w:tcPr>
+            <w:tcW w:w="6960" w:type="dxa"/>
+            <w:tcBorders>
+              <w:top w:val="single" w:color="BBCFE0" w:sz="1"/>
+              <w:left w:val="single" w:color="BBCFE0" w:sz="1"/>
+              <w:bottom w:val="single" w:color="BBCFE0" w:sz="1"/>
+              <w:right w:val="single" w:color="BBCFE0" w:sz="1"/>
+            </w:tcBorders>
+            <w:shd w:fill="FFFFFF" w:val="clear"/>
+            <w:tcMar>
+              <w:top w:type="dxa" w:w="80"/>
+              <w:left w:type="dxa" w:w="160"/>
+              <w:bottom w:type="dxa" w:w="80"/>
+              <w:right w:type="dxa" w:w="160"/>
+            </w:tcMar>
+          </w:tcPr>
+          <w:p>
+            <w:r>
+              <w:rPr>
+                <w:rFonts w:ascii="Arial" w:hAnsi="Arial"/>
+                <w:b w:val="0"/>
+                <w:color w:val="2C2C2C"/>
+                <w:sz w:val="20"/>
+              </w:rPr>
+              <w:t>Faktüel tutarlılık artırıldı; ana argüman değişmedi.</w:t>
             </w:r>
           </w:p>
         </w:tc>
@@ -13617,7 +14730,7 @@
         </w:pBdr>
       </w:pPr>
       <w:r>
-        <w:t>Özet: En Kritik 15 Karar</w:t>
+        <w:t>Özet: En Kritik 18 Karar</w:t>
       </w:r>
     </w:p>
     <w:p>
@@ -15086,7 +16199,274 @@
                 <w:color w:val="2C2C2C"/>
                 <w:sz w:val="20"/>
               </w:rPr>
-              <w:t>Oracle deneyi &gt;=90% dedektör hedefini karşılıyor — %100 doğruluk bile sigma_only'yi geçemedi (p=0.301)</w:t>
+              <w:t>Oracle deneyi &gt;=90% dedektör hedefini karşılıyor — %100 doğruluk bile sigma_only'yi geçemedi (p=0.115)</w:t>
+            </w:r>
+          </w:p>
+        </w:tc>
+        <w:tc>
+          <w:tcPr>
+            <w:tcW w:w="1000" w:type="dxa"/>
+            <w:tcBorders>
+              <w:top w:val="single" w:color="BBCFE0" w:sz="1"/>
+              <w:left w:val="single" w:color="BBCFE0" w:sz="1"/>
+              <w:bottom w:val="single" w:color="BBCFE0" w:sz="1"/>
+              <w:right w:val="single" w:color="BBCFE0" w:sz="1"/>
+            </w:tcBorders>
+            <w:shd w:fill="E8F4FD" w:val="clear"/>
+            <w:tcMar>
+              <w:top w:type="dxa" w:w="80"/>
+              <w:left w:type="dxa" w:w="160"/>
+              <w:bottom w:type="dxa" w:w="80"/>
+              <w:right w:type="dxa" w:w="160"/>
+            </w:tcMar>
+          </w:tcPr>
+          <w:p>
+            <w:r>
+              <w:rPr>
+                <w:rFonts w:ascii="Arial" w:hAnsi="Arial"/>
+                <w:b w:val="0"/>
+                <w:color w:val="2C2C2C"/>
+                <w:sz w:val="20"/>
+              </w:rPr>
+              <w:t>WP5</w:t>
+            </w:r>
+          </w:p>
+        </w:tc>
+      </w:tr>
+      <w:tr>
+        <w:tc>
+          <w:tcPr>
+            <w:tcW w:w="600" w:type="dxa"/>
+            <w:tcBorders>
+              <w:top w:val="single" w:color="BBCFE0" w:sz="1"/>
+              <w:left w:val="single" w:color="BBCFE0" w:sz="1"/>
+              <w:bottom w:val="single" w:color="BBCFE0" w:sz="1"/>
+              <w:right w:val="single" w:color="BBCFE0" w:sz="1"/>
+            </w:tcBorders>
+            <w:shd w:fill="E8F4FD" w:val="clear"/>
+            <w:tcMar>
+              <w:top w:type="dxa" w:w="80"/>
+              <w:left w:type="dxa" w:w="160"/>
+              <w:bottom w:type="dxa" w:w="80"/>
+              <w:right w:type="dxa" w:w="160"/>
+            </w:tcMar>
+          </w:tcPr>
+          <w:p>
+            <w:r>
+              <w:rPr>
+                <w:rFonts w:ascii="Arial" w:hAnsi="Arial"/>
+                <w:b/>
+                <w:color w:val="1F4E79"/>
+                <w:sz w:val="20"/>
+              </w:rPr>
+              <w:t>16</w:t>
+            </w:r>
+          </w:p>
+        </w:tc>
+        <w:tc>
+          <w:tcPr>
+            <w:tcW w:w="6960" w:type="dxa"/>
+            <w:tcBorders>
+              <w:top w:val="single" w:color="BBCFE0" w:sz="1"/>
+              <w:left w:val="single" w:color="BBCFE0" w:sz="1"/>
+              <w:bottom w:val="single" w:color="BBCFE0" w:sz="1"/>
+              <w:right w:val="single" w:color="BBCFE0" w:sz="1"/>
+            </w:tcBorders>
+            <w:shd w:fill="E8F4FD" w:val="clear"/>
+            <w:tcMar>
+              <w:top w:type="dxa" w:w="80"/>
+              <w:left w:type="dxa" w:w="160"/>
+              <w:bottom w:type="dxa" w:w="80"/>
+              <w:right w:type="dxa" w:w="160"/>
+            </w:tcMar>
+          </w:tcPr>
+          <w:p>
+            <w:r>
+              <w:rPr>
+                <w:rFonts w:ascii="Arial" w:hAnsi="Arial"/>
+                <w:b w:val="0"/>
+                <w:color w:val="2C2C2C"/>
+                <w:sz w:val="20"/>
+              </w:rPr>
+              <w:t>thesis_19 — inv_p99 birim hatası (tick→lot) ve oracle paradox p-değeri etiketi (0.301→0.115) düzeltildi</w:t>
+            </w:r>
+          </w:p>
+        </w:tc>
+        <w:tc>
+          <w:tcPr>
+            <w:tcW w:w="1000" w:type="dxa"/>
+            <w:tcBorders>
+              <w:top w:val="single" w:color="BBCFE0" w:sz="1"/>
+              <w:left w:val="single" w:color="BBCFE0" w:sz="1"/>
+              <w:bottom w:val="single" w:color="BBCFE0" w:sz="1"/>
+              <w:right w:val="single" w:color="BBCFE0" w:sz="1"/>
+            </w:tcBorders>
+            <w:shd w:fill="E8F4FD" w:val="clear"/>
+            <w:tcMar>
+              <w:top w:type="dxa" w:w="80"/>
+              <w:left w:type="dxa" w:w="160"/>
+              <w:bottom w:type="dxa" w:w="80"/>
+              <w:right w:type="dxa" w:w="160"/>
+            </w:tcMar>
+          </w:tcPr>
+          <w:p>
+            <w:r>
+              <w:rPr>
+                <w:rFonts w:ascii="Arial" w:hAnsi="Arial"/>
+                <w:b w:val="0"/>
+                <w:color w:val="2C2C2C"/>
+                <w:sz w:val="20"/>
+              </w:rPr>
+              <w:t>WP5</w:t>
+            </w:r>
+          </w:p>
+        </w:tc>
+      </w:tr>
+      <w:tr>
+        <w:tc>
+          <w:tcPr>
+            <w:tcW w:w="600" w:type="dxa"/>
+            <w:tcBorders>
+              <w:top w:val="single" w:color="BBCFE0" w:sz="1"/>
+              <w:left w:val="single" w:color="BBCFE0" w:sz="1"/>
+              <w:bottom w:val="single" w:color="BBCFE0" w:sz="1"/>
+              <w:right w:val="single" w:color="BBCFE0" w:sz="1"/>
+            </w:tcBorders>
+            <w:shd w:fill="E8F4FD" w:val="clear"/>
+            <w:tcMar>
+              <w:top w:type="dxa" w:w="80"/>
+              <w:left w:type="dxa" w:w="160"/>
+              <w:bottom w:type="dxa" w:w="80"/>
+              <w:right w:type="dxa" w:w="160"/>
+            </w:tcMar>
+          </w:tcPr>
+          <w:p>
+            <w:r>
+              <w:rPr>
+                <w:rFonts w:ascii="Arial" w:hAnsi="Arial"/>
+                <w:b/>
+                <w:color w:val="1F4E79"/>
+                <w:sz w:val="20"/>
+              </w:rPr>
+              <w:t>17</w:t>
+            </w:r>
+          </w:p>
+        </w:tc>
+        <w:tc>
+          <w:tcPr>
+            <w:tcW w:w="6960" w:type="dxa"/>
+            <w:tcBorders>
+              <w:top w:val="single" w:color="BBCFE0" w:sz="1"/>
+              <w:left w:val="single" w:color="BBCFE0" w:sz="1"/>
+              <w:bottom w:val="single" w:color="BBCFE0" w:sz="1"/>
+              <w:right w:val="single" w:color="BBCFE0" w:sz="1"/>
+            </w:tcBorders>
+            <w:shd w:fill="E8F4FD" w:val="clear"/>
+            <w:tcMar>
+              <w:top w:type="dxa" w:w="80"/>
+              <w:left w:type="dxa" w:w="160"/>
+              <w:bottom w:type="dxa" w:w="80"/>
+              <w:right w:type="dxa" w:w="160"/>
+            </w:tcMar>
+          </w:tcPr>
+          <w:p>
+            <w:r>
+              <w:rPr>
+                <w:rFonts w:ascii="Arial" w:hAnsi="Arial"/>
+                <w:b w:val="0"/>
+                <w:color w:val="2C2C2C"/>
+                <w:sz w:val="20"/>
+              </w:rPr>
+              <w:t>thesis_20 — Tablo 3 Bonferroni 10→12 karşılaştırma (α=0.001→0.00083); combined vs AS/naive equity eklendi</w:t>
+            </w:r>
+          </w:p>
+        </w:tc>
+        <w:tc>
+          <w:tcPr>
+            <w:tcW w:w="1000" w:type="dxa"/>
+            <w:tcBorders>
+              <w:top w:val="single" w:color="BBCFE0" w:sz="1"/>
+              <w:left w:val="single" w:color="BBCFE0" w:sz="1"/>
+              <w:bottom w:val="single" w:color="BBCFE0" w:sz="1"/>
+              <w:right w:val="single" w:color="BBCFE0" w:sz="1"/>
+            </w:tcBorders>
+            <w:shd w:fill="E8F4FD" w:val="clear"/>
+            <w:tcMar>
+              <w:top w:type="dxa" w:w="80"/>
+              <w:left w:type="dxa" w:w="160"/>
+              <w:bottom w:type="dxa" w:w="80"/>
+              <w:right w:type="dxa" w:w="160"/>
+            </w:tcMar>
+          </w:tcPr>
+          <w:p>
+            <w:r>
+              <w:rPr>
+                <w:rFonts w:ascii="Arial" w:hAnsi="Arial"/>
+                <w:b w:val="0"/>
+                <w:color w:val="2C2C2C"/>
+                <w:sz w:val="20"/>
+              </w:rPr>
+              <w:t>WP5</w:t>
+            </w:r>
+          </w:p>
+        </w:tc>
+      </w:tr>
+      <w:tr>
+        <w:tc>
+          <w:tcPr>
+            <w:tcW w:w="600" w:type="dxa"/>
+            <w:tcBorders>
+              <w:top w:val="single" w:color="BBCFE0" w:sz="1"/>
+              <w:left w:val="single" w:color="BBCFE0" w:sz="1"/>
+              <w:bottom w:val="single" w:color="BBCFE0" w:sz="1"/>
+              <w:right w:val="single" w:color="BBCFE0" w:sz="1"/>
+            </w:tcBorders>
+            <w:shd w:fill="E8F4FD" w:val="clear"/>
+            <w:tcMar>
+              <w:top w:type="dxa" w:w="80"/>
+              <w:left w:type="dxa" w:w="160"/>
+              <w:bottom w:type="dxa" w:w="80"/>
+              <w:right w:type="dxa" w:w="160"/>
+            </w:tcMar>
+          </w:tcPr>
+          <w:p>
+            <w:r>
+              <w:rPr>
+                <w:rFonts w:ascii="Arial" w:hAnsi="Arial"/>
+                <w:b/>
+                <w:color w:val="1F4E79"/>
+                <w:sz w:val="20"/>
+              </w:rPr>
+              <w:t>18</w:t>
+            </w:r>
+          </w:p>
+        </w:tc>
+        <w:tc>
+          <w:tcPr>
+            <w:tcW w:w="6960" w:type="dxa"/>
+            <w:tcBorders>
+              <w:top w:val="single" w:color="BBCFE0" w:sz="1"/>
+              <w:left w:val="single" w:color="BBCFE0" w:sz="1"/>
+              <w:bottom w:val="single" w:color="BBCFE0" w:sz="1"/>
+              <w:right w:val="single" w:color="BBCFE0" w:sz="1"/>
+            </w:tcBorders>
+            <w:shd w:fill="E8F4FD" w:val="clear"/>
+            <w:tcMar>
+              <w:top w:type="dxa" w:w="80"/>
+              <w:left w:type="dxa" w:w="160"/>
+              <w:bottom w:type="dxa" w:w="80"/>
+              <w:right w:type="dxa" w:w="160"/>
+            </w:tcMar>
+          </w:tcPr>
+          <w:p>
+            <w:r>
+              <w:rPr>
+                <w:rFonts w:ascii="Arial" w:hAnsi="Arial"/>
+                <w:b w:val="0"/>
+                <w:color w:val="2C2C2C"/>
+                <w:sz w:val="20"/>
+              </w:rPr>
+              <w:t>thesis_21 — Sec 4.7 üç→beş varyant, Tablo 7 Std Sharpe kaldırıldı, oracle paradox p=0.115 güncellendi</w:t>
             </w:r>
           </w:p>
         </w:tc>

</xml_diff>